<commit_message>
feat: enhance additive manufacturing labs with diagnostic models
</commit_message>
<xml_diff>
--- a/courseware/LP-Innovating Product Development with 3D Printing and Additive Manufacturing.docx
+++ b/courseware/LP-Innovating Product Development with 3D Printing and Additive Manufacturing.docx
@@ -179,7 +179,7 @@
           <w:color w:val="1F6FEB"/>
           <w:sz w:val="24"/>
         </w:rPr>
-        <w:t>Version 8.0</w:t>
+        <w:t>Version 8.1</w:t>
       </w:r>
     </w:p>
     <w:p>
@@ -381,6 +381,64 @@
                 <w:sz w:val="19"/>
               </w:rPr>
               <w:t>Full regeneration: single-source rebuild aligned to the v8.0 slide deck (150 slides), 16 hands-on labs in per-lab folders, enriched AM content (NIST/ISO-ASTM process families, materials, case studies) and the WA (SAQ) + PP assessment.</w:t>
+            </w:r>
+          </w:p>
+        </w:tc>
+        <w:tc>
+          <w:tcPr>
+            <w:tcW w:type="dxa" w:w="2160"/>
+          </w:tcPr>
+          <w:p>
+            <w:r/>
+            <w:r>
+              <w:rPr>
+                <w:sz w:val="19"/>
+              </w:rPr>
+              <w:t>Dr Alfred Ang</w:t>
+            </w:r>
+          </w:p>
+        </w:tc>
+      </w:tr>
+      <w:tr>
+        <w:tc>
+          <w:tcPr>
+            <w:tcW w:type="dxa" w:w="2160"/>
+          </w:tcPr>
+          <w:p>
+            <w:r/>
+            <w:r>
+              <w:rPr>
+                <w:sz w:val="19"/>
+              </w:rPr>
+              <w:t>8.1</w:t>
+            </w:r>
+          </w:p>
+        </w:tc>
+        <w:tc>
+          <w:tcPr>
+            <w:tcW w:type="dxa" w:w="2160"/>
+          </w:tcPr>
+          <w:p>
+            <w:r/>
+            <w:r>
+              <w:rPr>
+                <w:sz w:val="19"/>
+              </w:rPr>
+              <w:t>22 August 2026</w:t>
+            </w:r>
+          </w:p>
+        </w:tc>
+        <w:tc>
+          <w:tcPr>
+            <w:tcW w:type="dxa" w:w="2160"/>
+          </w:tcPr>
+          <w:p>
+            <w:r/>
+            <w:r>
+              <w:rPr>
+                <w:sz w:val="19"/>
+              </w:rPr>
+              <w:t>Aligned the 150-slide deck and 16-lab schedule to the supplied diagnostic STL/Fusion/Cura assets; added evidence-based calibration, support, retraction, cooling, wall, optimisation and finishing tasks.</w:t>
             </w:r>
           </w:p>
         </w:tc>
@@ -1146,6 +1204,10 @@
         <w:gridCol w:w="2880"/>
       </w:tblGrid>
       <w:tr>
+        <w:trPr>
+          <w:tblHeader/>
+          <w:cantSplit/>
+        </w:trPr>
         <w:tc>
           <w:tcPr>
             <w:tcW w:type="dxa" w:w="1656"/>
@@ -1202,6 +1264,9 @@
         </w:tc>
       </w:tr>
       <w:tr>
+        <w:trPr>
+          <w:cantSplit/>
+        </w:trPr>
         <w:tc>
           <w:tcPr>
             <w:tcW w:type="dxa" w:w="1656"/>
@@ -1255,6 +1320,9 @@
         </w:tc>
       </w:tr>
       <w:tr>
+        <w:trPr>
+          <w:cantSplit/>
+        </w:trPr>
         <w:tc>
           <w:tcPr>
             <w:tcW w:type="dxa" w:w="1656"/>
@@ -1308,6 +1376,9 @@
         </w:tc>
       </w:tr>
       <w:tr>
+        <w:trPr>
+          <w:cantSplit/>
+        </w:trPr>
         <w:tc>
           <w:tcPr>
             <w:tcW w:type="dxa" w:w="1656"/>
@@ -1361,6 +1432,9 @@
         </w:tc>
       </w:tr>
       <w:tr>
+        <w:trPr>
+          <w:cantSplit/>
+        </w:trPr>
         <w:tc>
           <w:tcPr>
             <w:tcW w:type="dxa" w:w="1656"/>
@@ -1411,6 +1485,9 @@
         </w:tc>
       </w:tr>
       <w:tr>
+        <w:trPr>
+          <w:cantSplit/>
+        </w:trPr>
         <w:tc>
           <w:tcPr>
             <w:tcW w:type="dxa" w:w="1656"/>
@@ -1464,6 +1541,9 @@
         </w:tc>
       </w:tr>
       <w:tr>
+        <w:trPr>
+          <w:cantSplit/>
+        </w:trPr>
         <w:tc>
           <w:tcPr>
             <w:tcW w:type="dxa" w:w="1656"/>
@@ -1514,6 +1594,9 @@
         </w:tc>
       </w:tr>
       <w:tr>
+        <w:trPr>
+          <w:cantSplit/>
+        </w:trPr>
         <w:tc>
           <w:tcPr>
             <w:tcW w:type="dxa" w:w="1656"/>
@@ -1567,6 +1650,9 @@
         </w:tc>
       </w:tr>
       <w:tr>
+        <w:trPr>
+          <w:cantSplit/>
+        </w:trPr>
         <w:tc>
           <w:tcPr>
             <w:tcW w:type="dxa" w:w="1656"/>
@@ -1617,6 +1703,9 @@
         </w:tc>
       </w:tr>
       <w:tr>
+        <w:trPr>
+          <w:cantSplit/>
+        </w:trPr>
         <w:tc>
           <w:tcPr>
             <w:tcW w:type="dxa" w:w="1656"/>
@@ -1701,6 +1790,10 @@
         <w:gridCol w:w="2880"/>
       </w:tblGrid>
       <w:tr>
+        <w:trPr>
+          <w:tblHeader/>
+          <w:cantSplit/>
+        </w:trPr>
         <w:tc>
           <w:tcPr>
             <w:tcW w:type="dxa" w:w="1656"/>
@@ -1757,6 +1850,9 @@
         </w:tc>
       </w:tr>
       <w:tr>
+        <w:trPr>
+          <w:cantSplit/>
+        </w:trPr>
         <w:tc>
           <w:tcPr>
             <w:tcW w:type="dxa" w:w="1656"/>
@@ -1810,6 +1906,9 @@
         </w:tc>
       </w:tr>
       <w:tr>
+        <w:trPr>
+          <w:cantSplit/>
+        </w:trPr>
         <w:tc>
           <w:tcPr>
             <w:tcW w:type="dxa" w:w="1656"/>
@@ -1863,6 +1962,9 @@
         </w:tc>
       </w:tr>
       <w:tr>
+        <w:trPr>
+          <w:cantSplit/>
+        </w:trPr>
         <w:tc>
           <w:tcPr>
             <w:tcW w:type="dxa" w:w="1656"/>
@@ -1916,6 +2018,9 @@
         </w:tc>
       </w:tr>
       <w:tr>
+        <w:trPr>
+          <w:cantSplit/>
+        </w:trPr>
         <w:tc>
           <w:tcPr>
             <w:tcW w:type="dxa" w:w="1656"/>
@@ -1966,6 +2071,9 @@
         </w:tc>
       </w:tr>
       <w:tr>
+        <w:trPr>
+          <w:cantSplit/>
+        </w:trPr>
         <w:tc>
           <w:tcPr>
             <w:tcW w:type="dxa" w:w="1656"/>
@@ -2019,6 +2127,9 @@
         </w:tc>
       </w:tr>
       <w:tr>
+        <w:trPr>
+          <w:cantSplit/>
+        </w:trPr>
         <w:tc>
           <w:tcPr>
             <w:tcW w:type="dxa" w:w="1656"/>
@@ -2069,6 +2180,9 @@
         </w:tc>
       </w:tr>
       <w:tr>
+        <w:trPr>
+          <w:cantSplit/>
+        </w:trPr>
         <w:tc>
           <w:tcPr>
             <w:tcW w:type="dxa" w:w="1656"/>
@@ -2122,6 +2236,9 @@
         </w:tc>
       </w:tr>
       <w:tr>
+        <w:trPr>
+          <w:cantSplit/>
+        </w:trPr>
         <w:tc>
           <w:tcPr>
             <w:tcW w:type="dxa" w:w="1656"/>
@@ -2175,6 +2292,9 @@
         </w:tc>
       </w:tr>
       <w:tr>
+        <w:trPr>
+          <w:cantSplit/>
+        </w:trPr>
         <w:tc>
           <w:tcPr>
             <w:tcW w:type="dxa" w:w="1656"/>
@@ -2228,6 +2348,9 @@
         </w:tc>
       </w:tr>
       <w:tr>
+        <w:trPr>
+          <w:cantSplit/>
+        </w:trPr>
         <w:tc>
           <w:tcPr>
             <w:tcW w:type="dxa" w:w="1656"/>

</xml_diff>